<commit_message>
feat(pd): aktualne sablony z kitu (Projekcia+RevPro+admin) + PDF-fill engine (pdf_forms.py, RDC 26/26 overene) + Make field-mapy
</commit_message>
<xml_diff>
--- a/templates_projekcia/Tit_Zoz_POUVV.docx
+++ b/templates_projekcia/Tit_Zoz_POUVV.docx
@@ -235,7 +235,7 @@
                 <w:szCs w:val="20"/>
                 <w:lang w:val="sk-SK"/>
               </w:rPr>
-              <w:t>psc_mesto</w:t>
+              <w:t>psc</w:t>
             </w:r>
             <w:proofErr w:type="spellEnd"/>
             <w:r>
@@ -247,22 +247,24 @@
               </w:rPr>
               <w:t>}}</w:t>
             </w:r>
-          </w:p>
-          <w:p>
-            <w:pPr>
-              <w:pStyle w:val="TableParagraph"/>
-              <w:tabs>
-                <w:tab w:val="left" w:pos="5110"/>
-              </w:tabs>
-              <w:spacing w:before="85" w:line="259" w:lineRule="auto"/>
-              <w:ind w:left="969" w:right="1286" w:hanging="2"/>
-              <w:rPr>
-                <w:rFonts w:ascii="Roboto" w:hAnsi="Roboto"/>
-                <w:sz w:val="21"/>
-                <w:szCs w:val="21"/>
-                <w:shd w:val="clear" w:color="auto" w:fill="FFFFFF"/>
-              </w:rPr>
-            </w:pPr>
+            <w:r>
+              <w:rPr>
+                <w:rFonts w:ascii="Arial" w:eastAsia="Arial Narrow" w:hAnsi="Arial" w:cs="Arial"/>
+                <w:sz w:val="20"/>
+                <w:szCs w:val="20"/>
+                <w:lang w:val="sk-SK"/>
+              </w:rPr>
+              <w:t xml:space="preserve"> </w:t>
+            </w:r>
+            <w:r>
+              <w:rPr>
+                <w:rFonts w:ascii="Arial" w:eastAsia="Arial Narrow" w:hAnsi="Arial" w:cs="Arial"/>
+                <w:sz w:val="20"/>
+                <w:szCs w:val="20"/>
+                <w:lang w:val="sk-SK"/>
+              </w:rPr>
+              <w:t>{{mesto}}</w:t>
+            </w:r>
             <w:r>
               <w:rPr>
                 <w:rFonts w:ascii="Roboto" w:hAnsi="Roboto"/>
@@ -3000,7 +3002,7 @@
                 <w:szCs w:val="20"/>
                 <w:lang w:val="sk-SK"/>
               </w:rPr>
-              <w:t>psc_mesto</w:t>
+              <w:t>psc</w:t>
             </w:r>
             <w:proofErr w:type="spellEnd"/>
             <w:r>
@@ -3010,7 +3012,7 @@
                 <w:szCs w:val="20"/>
                 <w:lang w:val="sk-SK"/>
               </w:rPr>
-              <w:t>}}</w:t>
+              <w:t>}} {{mesto}}</w:t>
             </w:r>
           </w:p>
           <w:p>
@@ -5898,7 +5900,7 @@
                 <w:sz w:val="16"/>
                 <w:szCs w:val="16"/>
               </w:rPr>
-              <w:t>psc_mesto</w:t>
+              <w:t>psc</w:t>
             </w:r>
             <w:proofErr w:type="spellEnd"/>
             <w:r>
@@ -5907,7 +5909,7 @@
                 <w:sz w:val="16"/>
                 <w:szCs w:val="16"/>
               </w:rPr>
-              <w:t>}}</w:t>
+              <w:t>}} {{mesto}}</w:t>
             </w:r>
           </w:p>
         </w:tc>
@@ -7063,7 +7065,13 @@
               <w:rPr>
                 <w:rFonts w:ascii="Arial" w:hAnsi="Arial" w:cs="Arial"/>
               </w:rPr>
-              <w:t>Technická správa</w:t>
+              <w:t>Súhrnná t</w:t>
+            </w:r>
+            <w:r>
+              <w:rPr>
+                <w:rFonts w:ascii="Arial" w:hAnsi="Arial" w:cs="Arial"/>
+              </w:rPr>
+              <w:t>echnická správa</w:t>
             </w:r>
           </w:p>
         </w:tc>
@@ -7129,9 +7137,8 @@
               <w:rPr>
                 <w:rFonts w:ascii="Arial" w:hAnsi="Arial" w:cs="Arial"/>
                 <w:bCs/>
-                <w:highlight w:val="yellow"/>
-              </w:rPr>
-              <w:t>22</w:t>
+              </w:rPr>
+              <w:t>9</w:t>
             </w:r>
           </w:p>
         </w:tc>
@@ -7184,15 +7191,7 @@
                 <w:bCs/>
                 <w:iCs/>
               </w:rPr>
-              <w:t>0</w:t>
-            </w:r>
-            <w:r>
-              <w:rPr>
-                <w:rFonts w:ascii="Arial" w:hAnsi="Arial" w:cs="Arial"/>
-                <w:bCs/>
-                <w:iCs/>
-              </w:rPr>
-              <w:t>4</w:t>
+              <w:t>04</w:t>
             </w:r>
           </w:p>
         </w:tc>
@@ -7212,7 +7211,7 @@
               <w:rPr>
                 <w:rFonts w:ascii="Arial" w:hAnsi="Arial" w:cs="Arial"/>
               </w:rPr>
-              <w:t>Jednopólová schéma</w:t>
+              <w:t>Technická správa</w:t>
             </w:r>
           </w:p>
         </w:tc>
@@ -7256,31 +7255,38 @@
               <w:rPr>
                 <w:rFonts w:ascii="Arial" w:hAnsi="Arial" w:cs="Arial"/>
                 <w:bCs/>
+              </w:rPr>
+              <w:t>A4</w:t>
+            </w:r>
+          </w:p>
+        </w:tc>
+        <w:tc>
+          <w:tcPr>
+            <w:tcW w:w="776" w:type="dxa"/>
+            <w:vAlign w:val="center"/>
+          </w:tcPr>
+          <w:p>
+            <w:pPr>
+              <w:jc w:val="center"/>
+              <w:rPr>
+                <w:rFonts w:ascii="Arial" w:hAnsi="Arial" w:cs="Arial"/>
+                <w:bCs/>
+              </w:rPr>
+            </w:pPr>
+            <w:r>
+              <w:rPr>
+                <w:rFonts w:ascii="Arial" w:hAnsi="Arial" w:cs="Arial"/>
+                <w:bCs/>
                 <w:highlight w:val="yellow"/>
               </w:rPr>
-              <w:t>A2</w:t>
-            </w:r>
-          </w:p>
-        </w:tc>
-        <w:tc>
-          <w:tcPr>
-            <w:tcW w:w="776" w:type="dxa"/>
-            <w:vAlign w:val="center"/>
-          </w:tcPr>
-          <w:p>
-            <w:pPr>
-              <w:jc w:val="center"/>
-              <w:rPr>
-                <w:rFonts w:ascii="Arial" w:hAnsi="Arial" w:cs="Arial"/>
-                <w:bCs/>
-              </w:rPr>
-            </w:pPr>
-            <w:r>
-              <w:rPr>
-                <w:rFonts w:ascii="Arial" w:hAnsi="Arial" w:cs="Arial"/>
-                <w:bCs/>
-              </w:rPr>
-              <w:t>1</w:t>
+              <w:t>2</w:t>
+            </w:r>
+            <w:r>
+              <w:rPr>
+                <w:rFonts w:ascii="Arial" w:hAnsi="Arial" w:cs="Arial"/>
+                <w:bCs/>
+              </w:rPr>
+              <w:t>3</w:t>
             </w:r>
           </w:p>
         </w:tc>
@@ -7327,14 +7333,6 @@
                 <w:iCs/>
               </w:rPr>
             </w:pPr>
-            <w:r>
-              <w:rPr>
-                <w:rFonts w:ascii="Arial" w:hAnsi="Arial" w:cs="Arial"/>
-                <w:bCs/>
-                <w:iCs/>
-              </w:rPr>
-              <w:t>05</w:t>
-            </w:r>
           </w:p>
         </w:tc>
         <w:tc>
@@ -7349,26 +7347,6 @@
                 <w:rFonts w:ascii="Arial" w:hAnsi="Arial" w:cs="Arial"/>
               </w:rPr>
             </w:pPr>
-            <w:r>
-              <w:rPr>
-                <w:rFonts w:ascii="Arial" w:hAnsi="Arial" w:cs="Arial"/>
-              </w:rPr>
-              <w:t xml:space="preserve">Schémy zapojenia, Zoznam káblov, </w:t>
-            </w:r>
-            <w:proofErr w:type="spellStart"/>
-            <w:r>
-              <w:rPr>
-                <w:rFonts w:ascii="Arial" w:hAnsi="Arial" w:cs="Arial"/>
-              </w:rPr>
-              <w:t>Kusovník</w:t>
-            </w:r>
-            <w:proofErr w:type="spellEnd"/>
-            <w:r>
-              <w:rPr>
-                <w:rFonts w:ascii="Arial" w:hAnsi="Arial" w:cs="Arial"/>
-              </w:rPr>
-              <w:t xml:space="preserve"> komponentov</w:t>
-            </w:r>
           </w:p>
         </w:tc>
         <w:tc>
@@ -7385,13 +7363,6 @@
                 <w:bCs/>
               </w:rPr>
             </w:pPr>
-            <w:r>
-              <w:rPr>
-                <w:rFonts w:ascii="Arial" w:hAnsi="Arial" w:cs="Arial"/>
-                <w:bCs/>
-              </w:rPr>
-              <w:t>0</w:t>
-            </w:r>
           </w:p>
         </w:tc>
         <w:tc>
@@ -7407,13 +7378,6 @@
                 <w:bCs/>
               </w:rPr>
             </w:pPr>
-            <w:r>
-              <w:rPr>
-                <w:rFonts w:ascii="Arial" w:hAnsi="Arial" w:cs="Arial"/>
-                <w:bCs/>
-              </w:rPr>
-              <w:t>A4</w:t>
-            </w:r>
           </w:p>
         </w:tc>
         <w:tc>
@@ -7427,16 +7391,9 @@
               <w:rPr>
                 <w:rFonts w:ascii="Arial" w:hAnsi="Arial" w:cs="Arial"/>
                 <w:bCs/>
-              </w:rPr>
-            </w:pPr>
-            <w:r>
-              <w:rPr>
-                <w:rFonts w:ascii="Arial" w:hAnsi="Arial" w:cs="Arial"/>
-                <w:bCs/>
                 <w:highlight w:val="yellow"/>
               </w:rPr>
-              <w:t>15</w:t>
-            </w:r>
+            </w:pPr>
           </w:p>
         </w:tc>
         <w:tc>
@@ -7452,13 +7409,6 @@
                 <w:bCs/>
               </w:rPr>
             </w:pPr>
-            <w:r>
-              <w:rPr>
-                <w:rFonts w:ascii="Arial" w:hAnsi="Arial" w:cs="Arial"/>
-                <w:bCs/>
-              </w:rPr>
-              <w:t>1</w:t>
-            </w:r>
           </w:p>
         </w:tc>
       </w:tr>
@@ -7478,8 +7428,26 @@
             <w:pPr>
               <w:rPr>
                 <w:rFonts w:ascii="Arial" w:hAnsi="Arial" w:cs="Arial"/>
-              </w:rPr>
-            </w:pPr>
+                <w:bCs/>
+                <w:iCs/>
+              </w:rPr>
+            </w:pPr>
+            <w:r>
+              <w:rPr>
+                <w:rFonts w:ascii="Arial" w:hAnsi="Arial" w:cs="Arial"/>
+                <w:bCs/>
+                <w:iCs/>
+              </w:rPr>
+              <w:t>0</w:t>
+            </w:r>
+            <w:r>
+              <w:rPr>
+                <w:rFonts w:ascii="Arial" w:hAnsi="Arial" w:cs="Arial"/>
+                <w:bCs/>
+                <w:iCs/>
+              </w:rPr>
+              <w:t>5</w:t>
+            </w:r>
           </w:p>
         </w:tc>
         <w:tc>
@@ -7494,6 +7462,12 @@
                 <w:rFonts w:ascii="Arial" w:hAnsi="Arial" w:cs="Arial"/>
               </w:rPr>
             </w:pPr>
+            <w:r>
+              <w:rPr>
+                <w:rFonts w:ascii="Arial" w:hAnsi="Arial" w:cs="Arial"/>
+              </w:rPr>
+              <w:t>Jednopólová schéma</w:t>
+            </w:r>
           </w:p>
         </w:tc>
         <w:tc>
@@ -7510,6 +7484,13 @@
                 <w:bCs/>
               </w:rPr>
             </w:pPr>
+            <w:r>
+              <w:rPr>
+                <w:rFonts w:ascii="Arial" w:hAnsi="Arial" w:cs="Arial"/>
+                <w:bCs/>
+              </w:rPr>
+              <w:t>0</w:t>
+            </w:r>
           </w:p>
         </w:tc>
         <w:tc>
@@ -7525,6 +7506,14 @@
                 <w:bCs/>
               </w:rPr>
             </w:pPr>
+            <w:r>
+              <w:rPr>
+                <w:rFonts w:ascii="Arial" w:hAnsi="Arial" w:cs="Arial"/>
+                <w:bCs/>
+                <w:highlight w:val="yellow"/>
+              </w:rPr>
+              <w:t>A2</w:t>
+            </w:r>
           </w:p>
         </w:tc>
         <w:tc>
@@ -7540,6 +7529,13 @@
                 <w:bCs/>
               </w:rPr>
             </w:pPr>
+            <w:r>
+              <w:rPr>
+                <w:rFonts w:ascii="Arial" w:hAnsi="Arial" w:cs="Arial"/>
+                <w:bCs/>
+              </w:rPr>
+              <w:t>1</w:t>
+            </w:r>
           </w:p>
         </w:tc>
         <w:tc>
@@ -7555,6 +7551,13 @@
                 <w:bCs/>
               </w:rPr>
             </w:pPr>
+            <w:r>
+              <w:rPr>
+                <w:rFonts w:ascii="Arial" w:hAnsi="Arial" w:cs="Arial"/>
+                <w:bCs/>
+              </w:rPr>
+              <w:t>1</w:t>
+            </w:r>
           </w:p>
         </w:tc>
       </w:tr>
@@ -7574,19 +7577,17 @@
             <w:pPr>
               <w:rPr>
                 <w:rFonts w:ascii="Arial" w:hAnsi="Arial" w:cs="Arial"/>
-              </w:rPr>
-            </w:pPr>
-            <w:r>
-              <w:rPr>
-                <w:rFonts w:ascii="Arial" w:hAnsi="Arial" w:cs="Arial"/>
-              </w:rPr>
-              <w:t>0</w:t>
-            </w:r>
-            <w:r>
-              <w:rPr>
-                <w:rFonts w:ascii="Arial" w:hAnsi="Arial" w:cs="Arial"/>
-              </w:rPr>
-              <w:t>6</w:t>
+                <w:bCs/>
+                <w:iCs/>
+              </w:rPr>
+            </w:pPr>
+            <w:r>
+              <w:rPr>
+                <w:rFonts w:ascii="Arial" w:hAnsi="Arial" w:cs="Arial"/>
+                <w:bCs/>
+                <w:iCs/>
+              </w:rPr>
+              <w:t>06</w:t>
             </w:r>
           </w:p>
         </w:tc>
@@ -7606,7 +7607,7 @@
               <w:rPr>
                 <w:rFonts w:ascii="Arial" w:hAnsi="Arial" w:cs="Arial"/>
               </w:rPr>
-              <w:t>Situácia širších vzťahov</w:t>
+              <w:t>Schémy zapojenia</w:t>
             </w:r>
           </w:p>
         </w:tc>
@@ -7644,16 +7645,14 @@
               <w:rPr>
                 <w:rFonts w:ascii="Arial" w:hAnsi="Arial" w:cs="Arial"/>
                 <w:bCs/>
-                <w:highlight w:val="yellow"/>
-              </w:rPr>
-            </w:pPr>
-            <w:r>
-              <w:rPr>
-                <w:rFonts w:ascii="Arial" w:hAnsi="Arial" w:cs="Arial"/>
-                <w:bCs/>
-                <w:highlight w:val="yellow"/>
-              </w:rPr>
-              <w:t>A2</w:t>
+              </w:rPr>
+            </w:pPr>
+            <w:r>
+              <w:rPr>
+                <w:rFonts w:ascii="Arial" w:hAnsi="Arial" w:cs="Arial"/>
+                <w:bCs/>
+              </w:rPr>
+              <w:t>A4</w:t>
             </w:r>
           </w:p>
         </w:tc>
@@ -7675,7 +7674,7 @@
                 <w:rFonts w:ascii="Arial" w:hAnsi="Arial" w:cs="Arial"/>
                 <w:bCs/>
               </w:rPr>
-              <w:t>1</w:t>
+              <w:t>5</w:t>
             </w:r>
           </w:p>
         </w:tc>
@@ -7720,18 +7719,6 @@
                 <w:rFonts w:ascii="Arial" w:hAnsi="Arial" w:cs="Arial"/>
               </w:rPr>
             </w:pPr>
-            <w:r>
-              <w:rPr>
-                <w:rFonts w:ascii="Arial" w:hAnsi="Arial" w:cs="Arial"/>
-              </w:rPr>
-              <w:t>0</w:t>
-            </w:r>
-            <w:r>
-              <w:rPr>
-                <w:rFonts w:ascii="Arial" w:hAnsi="Arial" w:cs="Arial"/>
-              </w:rPr>
-              <w:t>7</w:t>
-            </w:r>
           </w:p>
         </w:tc>
         <w:tc>
@@ -7746,12 +7733,6 @@
                 <w:rFonts w:ascii="Arial" w:hAnsi="Arial" w:cs="Arial"/>
               </w:rPr>
             </w:pPr>
-            <w:r>
-              <w:rPr>
-                <w:rFonts w:ascii="Arial" w:hAnsi="Arial" w:cs="Arial"/>
-              </w:rPr>
-              <w:t>Dispozícia zariadení</w:t>
-            </w:r>
           </w:p>
         </w:tc>
         <w:tc>
@@ -7768,13 +7749,6 @@
                 <w:bCs/>
               </w:rPr>
             </w:pPr>
-            <w:r>
-              <w:rPr>
-                <w:rFonts w:ascii="Arial" w:hAnsi="Arial" w:cs="Arial"/>
-                <w:bCs/>
-              </w:rPr>
-              <w:t>0</w:t>
-            </w:r>
           </w:p>
         </w:tc>
         <w:tc>
@@ -7788,17 +7762,8 @@
               <w:rPr>
                 <w:rFonts w:ascii="Arial" w:hAnsi="Arial" w:cs="Arial"/>
                 <w:bCs/>
-                <w:highlight w:val="yellow"/>
-              </w:rPr>
-            </w:pPr>
-            <w:r>
-              <w:rPr>
-                <w:rFonts w:ascii="Arial" w:hAnsi="Arial" w:cs="Arial"/>
-                <w:bCs/>
-                <w:highlight w:val="yellow"/>
-              </w:rPr>
-              <w:t>A1</w:t>
-            </w:r>
+              </w:rPr>
+            </w:pPr>
           </w:p>
         </w:tc>
         <w:tc>
@@ -7814,13 +7779,6 @@
                 <w:bCs/>
               </w:rPr>
             </w:pPr>
-            <w:r>
-              <w:rPr>
-                <w:rFonts w:ascii="Arial" w:hAnsi="Arial" w:cs="Arial"/>
-                <w:bCs/>
-              </w:rPr>
-              <w:t>1</w:t>
-            </w:r>
           </w:p>
         </w:tc>
         <w:tc>
@@ -7836,13 +7794,6 @@
                 <w:bCs/>
               </w:rPr>
             </w:pPr>
-            <w:r>
-              <w:rPr>
-                <w:rFonts w:ascii="Arial" w:hAnsi="Arial" w:cs="Arial"/>
-                <w:bCs/>
-              </w:rPr>
-              <w:t>1</w:t>
-            </w:r>
           </w:p>
         </w:tc>
       </w:tr>
@@ -7864,6 +7815,18 @@
                 <w:rFonts w:ascii="Arial" w:hAnsi="Arial" w:cs="Arial"/>
               </w:rPr>
             </w:pPr>
+            <w:r>
+              <w:rPr>
+                <w:rFonts w:ascii="Arial" w:hAnsi="Arial" w:cs="Arial"/>
+              </w:rPr>
+              <w:t>0</w:t>
+            </w:r>
+            <w:r>
+              <w:rPr>
+                <w:rFonts w:ascii="Arial" w:hAnsi="Arial" w:cs="Arial"/>
+              </w:rPr>
+              <w:t>7</w:t>
+            </w:r>
           </w:p>
         </w:tc>
         <w:tc>
@@ -7878,6 +7841,12 @@
                 <w:rFonts w:ascii="Arial" w:hAnsi="Arial" w:cs="Arial"/>
               </w:rPr>
             </w:pPr>
+            <w:r>
+              <w:rPr>
+                <w:rFonts w:ascii="Arial" w:hAnsi="Arial" w:cs="Arial"/>
+              </w:rPr>
+              <w:t>Situácia širších vzťahov</w:t>
+            </w:r>
           </w:p>
         </w:tc>
         <w:tc>
@@ -7894,6 +7863,13 @@
                 <w:bCs/>
               </w:rPr>
             </w:pPr>
+            <w:r>
+              <w:rPr>
+                <w:rFonts w:ascii="Arial" w:hAnsi="Arial" w:cs="Arial"/>
+                <w:bCs/>
+              </w:rPr>
+              <w:t>0</w:t>
+            </w:r>
           </w:p>
         </w:tc>
         <w:tc>
@@ -7907,8 +7883,25 @@
               <w:rPr>
                 <w:rFonts w:ascii="Arial" w:hAnsi="Arial" w:cs="Arial"/>
                 <w:bCs/>
-              </w:rPr>
-            </w:pPr>
+                <w:highlight w:val="yellow"/>
+              </w:rPr>
+            </w:pPr>
+            <w:r>
+              <w:rPr>
+                <w:rFonts w:ascii="Arial" w:hAnsi="Arial" w:cs="Arial"/>
+                <w:bCs/>
+                <w:highlight w:val="yellow"/>
+              </w:rPr>
+              <w:t>A</w:t>
+            </w:r>
+            <w:r>
+              <w:rPr>
+                <w:rFonts w:ascii="Arial" w:hAnsi="Arial" w:cs="Arial"/>
+                <w:bCs/>
+                <w:highlight w:val="yellow"/>
+              </w:rPr>
+              <w:t>1</w:t>
+            </w:r>
           </w:p>
         </w:tc>
         <w:tc>
@@ -7924,6 +7917,13 @@
                 <w:bCs/>
               </w:rPr>
             </w:pPr>
+            <w:r>
+              <w:rPr>
+                <w:rFonts w:ascii="Arial" w:hAnsi="Arial" w:cs="Arial"/>
+                <w:bCs/>
+              </w:rPr>
+              <w:t>1</w:t>
+            </w:r>
           </w:p>
         </w:tc>
         <w:tc>
@@ -7939,6 +7939,13 @@
                 <w:bCs/>
               </w:rPr>
             </w:pPr>
+            <w:r>
+              <w:rPr>
+                <w:rFonts w:ascii="Arial" w:hAnsi="Arial" w:cs="Arial"/>
+                <w:bCs/>
+              </w:rPr>
+              <w:t>1</w:t>
+            </w:r>
           </w:p>
         </w:tc>
       </w:tr>
@@ -7964,7 +7971,13 @@
               <w:rPr>
                 <w:rFonts w:ascii="Arial" w:hAnsi="Arial" w:cs="Arial"/>
               </w:rPr>
-              <w:t>08</w:t>
+              <w:t>0</w:t>
+            </w:r>
+            <w:r>
+              <w:rPr>
+                <w:rFonts w:ascii="Arial" w:hAnsi="Arial" w:cs="Arial"/>
+              </w:rPr>
+              <w:t>8</w:t>
             </w:r>
           </w:p>
         </w:tc>
@@ -7984,7 +7997,7 @@
               <w:rPr>
                 <w:rFonts w:ascii="Arial" w:hAnsi="Arial" w:cs="Arial"/>
               </w:rPr>
-              <w:t>Protokol o určení vonkajších vplyvov</w:t>
+              <w:t>Dispozícia zariadení</w:t>
             </w:r>
           </w:p>
         </w:tc>
@@ -8022,14 +8035,16 @@
               <w:rPr>
                 <w:rFonts w:ascii="Arial" w:hAnsi="Arial" w:cs="Arial"/>
                 <w:bCs/>
-              </w:rPr>
-            </w:pPr>
-            <w:r>
-              <w:rPr>
-                <w:rFonts w:ascii="Arial" w:hAnsi="Arial" w:cs="Arial"/>
-                <w:bCs/>
-              </w:rPr>
-              <w:t>A4</w:t>
+                <w:highlight w:val="yellow"/>
+              </w:rPr>
+            </w:pPr>
+            <w:r>
+              <w:rPr>
+                <w:rFonts w:ascii="Arial" w:hAnsi="Arial" w:cs="Arial"/>
+                <w:bCs/>
+                <w:highlight w:val="yellow"/>
+              </w:rPr>
+              <w:t>A1</w:t>
             </w:r>
           </w:p>
         </w:tc>
@@ -8051,7 +8066,7 @@
                 <w:rFonts w:ascii="Arial" w:hAnsi="Arial" w:cs="Arial"/>
                 <w:bCs/>
               </w:rPr>
-              <w:t>3</w:t>
+              <w:t>1</w:t>
             </w:r>
           </w:p>
         </w:tc>
@@ -8216,29 +8231,7 @@
               <w:rPr>
                 <w:rFonts w:ascii="Arial" w:hAnsi="Arial" w:cs="Arial"/>
               </w:rPr>
-              <w:t>Technický list od FV panelov (</w:t>
-            </w:r>
-            <w:proofErr w:type="spellStart"/>
-            <w:r>
-              <w:rPr>
-                <w:rFonts w:ascii="Arial" w:hAnsi="Arial" w:cs="Arial"/>
-                <w:highlight w:val="yellow"/>
-              </w:rPr>
-              <w:t>Longi</w:t>
-            </w:r>
-            <w:proofErr w:type="spellEnd"/>
-            <w:r>
-              <w:rPr>
-                <w:rFonts w:ascii="Arial" w:hAnsi="Arial" w:cs="Arial"/>
-                <w:highlight w:val="yellow"/>
-              </w:rPr>
-              <w:t xml:space="preserve"> LR5-54HTH-460M</w:t>
-            </w:r>
-            <w:r>
-              <w:rPr>
-                <w:rFonts w:ascii="Arial" w:hAnsi="Arial" w:cs="Arial"/>
-              </w:rPr>
-              <w:t>)</w:t>
+              <w:t>Protokol o určení vonkajších vplyvov</w:t>
             </w:r>
           </w:p>
         </w:tc>
@@ -8305,7 +8298,7 @@
                 <w:rFonts w:ascii="Arial" w:hAnsi="Arial" w:cs="Arial"/>
                 <w:bCs/>
               </w:rPr>
-              <w:t>2</w:t>
+              <w:t>3</w:t>
             </w:r>
           </w:p>
         </w:tc>
@@ -8350,11 +8343,265 @@
                 <w:rFonts w:ascii="Arial" w:hAnsi="Arial" w:cs="Arial"/>
               </w:rPr>
             </w:pPr>
+          </w:p>
+        </w:tc>
+        <w:tc>
+          <w:tcPr>
+            <w:tcW w:w="5989" w:type="dxa"/>
+            <w:noWrap/>
+            <w:vAlign w:val="center"/>
+          </w:tcPr>
+          <w:p>
+            <w:pPr>
+              <w:rPr>
+                <w:rFonts w:ascii="Arial" w:hAnsi="Arial" w:cs="Arial"/>
+              </w:rPr>
+            </w:pPr>
+          </w:p>
+        </w:tc>
+        <w:tc>
+          <w:tcPr>
+            <w:tcW w:w="850" w:type="dxa"/>
+            <w:noWrap/>
+            <w:vAlign w:val="center"/>
+          </w:tcPr>
+          <w:p>
+            <w:pPr>
+              <w:jc w:val="center"/>
+              <w:rPr>
+                <w:rFonts w:ascii="Arial" w:hAnsi="Arial" w:cs="Arial"/>
+                <w:bCs/>
+              </w:rPr>
+            </w:pPr>
+          </w:p>
+        </w:tc>
+        <w:tc>
+          <w:tcPr>
+            <w:tcW w:w="964" w:type="dxa"/>
+            <w:vAlign w:val="center"/>
+          </w:tcPr>
+          <w:p>
+            <w:pPr>
+              <w:jc w:val="center"/>
+              <w:rPr>
+                <w:rFonts w:ascii="Arial" w:hAnsi="Arial" w:cs="Arial"/>
+                <w:bCs/>
+              </w:rPr>
+            </w:pPr>
+          </w:p>
+        </w:tc>
+        <w:tc>
+          <w:tcPr>
+            <w:tcW w:w="776" w:type="dxa"/>
+            <w:vAlign w:val="center"/>
+          </w:tcPr>
+          <w:p>
+            <w:pPr>
+              <w:jc w:val="center"/>
+              <w:rPr>
+                <w:rFonts w:ascii="Arial" w:hAnsi="Arial" w:cs="Arial"/>
+                <w:bCs/>
+              </w:rPr>
+            </w:pPr>
+          </w:p>
+        </w:tc>
+        <w:tc>
+          <w:tcPr>
+            <w:tcW w:w="890" w:type="dxa"/>
+            <w:vAlign w:val="center"/>
+          </w:tcPr>
+          <w:p>
+            <w:pPr>
+              <w:jc w:val="center"/>
+              <w:rPr>
+                <w:rFonts w:ascii="Arial" w:hAnsi="Arial" w:cs="Arial"/>
+                <w:bCs/>
+              </w:rPr>
+            </w:pPr>
+          </w:p>
+        </w:tc>
+      </w:tr>
+      <w:tr>
+        <w:trPr>
+          <w:trHeight w:val="283"/>
+          <w:tblHeader/>
+          <w:jc w:val="center"/>
+        </w:trPr>
+        <w:tc>
+          <w:tcPr>
+            <w:tcW w:w="669" w:type="dxa"/>
+            <w:noWrap/>
+            <w:vAlign w:val="center"/>
+          </w:tcPr>
+          <w:p>
+            <w:pPr>
+              <w:rPr>
+                <w:rFonts w:ascii="Arial" w:hAnsi="Arial" w:cs="Arial"/>
+              </w:rPr>
+            </w:pPr>
             <w:r>
               <w:rPr>
                 <w:rFonts w:ascii="Arial" w:hAnsi="Arial" w:cs="Arial"/>
               </w:rPr>
               <w:t>10</w:t>
+            </w:r>
+          </w:p>
+        </w:tc>
+        <w:tc>
+          <w:tcPr>
+            <w:tcW w:w="5989" w:type="dxa"/>
+            <w:noWrap/>
+            <w:vAlign w:val="center"/>
+          </w:tcPr>
+          <w:p>
+            <w:pPr>
+              <w:rPr>
+                <w:rFonts w:ascii="Arial" w:hAnsi="Arial" w:cs="Arial"/>
+              </w:rPr>
+            </w:pPr>
+            <w:r>
+              <w:rPr>
+                <w:rFonts w:ascii="Arial" w:hAnsi="Arial" w:cs="Arial"/>
+              </w:rPr>
+              <w:t>Technický list od FV panelov (</w:t>
+            </w:r>
+            <w:proofErr w:type="spellStart"/>
+            <w:r>
+              <w:rPr>
+                <w:rFonts w:ascii="Arial" w:hAnsi="Arial" w:cs="Arial"/>
+                <w:highlight w:val="yellow"/>
+              </w:rPr>
+              <w:t>Longi</w:t>
+            </w:r>
+            <w:proofErr w:type="spellEnd"/>
+            <w:r>
+              <w:rPr>
+                <w:rFonts w:ascii="Arial" w:hAnsi="Arial" w:cs="Arial"/>
+                <w:highlight w:val="yellow"/>
+              </w:rPr>
+              <w:t xml:space="preserve"> LR5-54HTH-460M</w:t>
+            </w:r>
+            <w:r>
+              <w:rPr>
+                <w:rFonts w:ascii="Arial" w:hAnsi="Arial" w:cs="Arial"/>
+              </w:rPr>
+              <w:t>)</w:t>
+            </w:r>
+          </w:p>
+        </w:tc>
+        <w:tc>
+          <w:tcPr>
+            <w:tcW w:w="850" w:type="dxa"/>
+            <w:noWrap/>
+            <w:vAlign w:val="center"/>
+          </w:tcPr>
+          <w:p>
+            <w:pPr>
+              <w:jc w:val="center"/>
+              <w:rPr>
+                <w:rFonts w:ascii="Arial" w:hAnsi="Arial" w:cs="Arial"/>
+                <w:bCs/>
+              </w:rPr>
+            </w:pPr>
+            <w:r>
+              <w:rPr>
+                <w:rFonts w:ascii="Arial" w:hAnsi="Arial" w:cs="Arial"/>
+                <w:bCs/>
+              </w:rPr>
+              <w:t>0</w:t>
+            </w:r>
+          </w:p>
+        </w:tc>
+        <w:tc>
+          <w:tcPr>
+            <w:tcW w:w="964" w:type="dxa"/>
+            <w:vAlign w:val="center"/>
+          </w:tcPr>
+          <w:p>
+            <w:pPr>
+              <w:jc w:val="center"/>
+              <w:rPr>
+                <w:rFonts w:ascii="Arial" w:hAnsi="Arial" w:cs="Arial"/>
+                <w:bCs/>
+              </w:rPr>
+            </w:pPr>
+            <w:r>
+              <w:rPr>
+                <w:rFonts w:ascii="Arial" w:hAnsi="Arial" w:cs="Arial"/>
+                <w:bCs/>
+              </w:rPr>
+              <w:t>A4</w:t>
+            </w:r>
+          </w:p>
+        </w:tc>
+        <w:tc>
+          <w:tcPr>
+            <w:tcW w:w="776" w:type="dxa"/>
+            <w:vAlign w:val="center"/>
+          </w:tcPr>
+          <w:p>
+            <w:pPr>
+              <w:jc w:val="center"/>
+              <w:rPr>
+                <w:rFonts w:ascii="Arial" w:hAnsi="Arial" w:cs="Arial"/>
+                <w:bCs/>
+              </w:rPr>
+            </w:pPr>
+            <w:r>
+              <w:rPr>
+                <w:rFonts w:ascii="Arial" w:hAnsi="Arial" w:cs="Arial"/>
+                <w:bCs/>
+              </w:rPr>
+              <w:t>2</w:t>
+            </w:r>
+          </w:p>
+        </w:tc>
+        <w:tc>
+          <w:tcPr>
+            <w:tcW w:w="890" w:type="dxa"/>
+            <w:vAlign w:val="center"/>
+          </w:tcPr>
+          <w:p>
+            <w:pPr>
+              <w:jc w:val="center"/>
+              <w:rPr>
+                <w:rFonts w:ascii="Arial" w:hAnsi="Arial" w:cs="Arial"/>
+                <w:bCs/>
+              </w:rPr>
+            </w:pPr>
+            <w:r>
+              <w:rPr>
+                <w:rFonts w:ascii="Arial" w:hAnsi="Arial" w:cs="Arial"/>
+                <w:bCs/>
+              </w:rPr>
+              <w:t>1</w:t>
+            </w:r>
+          </w:p>
+        </w:tc>
+      </w:tr>
+      <w:tr>
+        <w:trPr>
+          <w:trHeight w:val="283"/>
+          <w:tblHeader/>
+          <w:jc w:val="center"/>
+        </w:trPr>
+        <w:tc>
+          <w:tcPr>
+            <w:tcW w:w="669" w:type="dxa"/>
+            <w:noWrap/>
+            <w:vAlign w:val="center"/>
+          </w:tcPr>
+          <w:p>
+            <w:pPr>
+              <w:rPr>
+                <w:rFonts w:ascii="Arial" w:hAnsi="Arial" w:cs="Arial"/>
+              </w:rPr>
+            </w:pPr>
+            <w:r>
+              <w:rPr>
+                <w:rFonts w:ascii="Arial" w:hAnsi="Arial" w:cs="Arial"/>
+              </w:rPr>
+              <w:t>11</w:t>
             </w:r>
           </w:p>
         </w:tc>
@@ -8823,7 +9070,6 @@
           <w:sz w:val="28"/>
           <w:szCs w:val="28"/>
         </w:rPr>
-        <w:lastRenderedPageBreak/>
         <w:t>Protokol o určení vonkajších vplyvov</w:t>
       </w:r>
     </w:p>
@@ -9000,29 +9246,26 @@
       </w:r>
       <w:r>
         <w:rPr>
-          <w:rFonts w:ascii="ArialNarrow" w:hAnsi="ArialNarrow" w:cs="ArialNarrow"/>
+          <w:rFonts w:ascii="Arial" w:hAnsi="Arial" w:cs="Arial"/>
+          <w:szCs w:val="18"/>
         </w:rPr>
         <w:t>{{</w:t>
       </w:r>
       <w:proofErr w:type="spellStart"/>
       <w:r>
         <w:rPr>
-          <w:rFonts w:ascii="ArialNarrow" w:hAnsi="ArialNarrow" w:cs="ArialNarrow"/>
+          <w:rFonts w:ascii="Arial" w:hAnsi="Arial" w:cs="Arial"/>
+          <w:szCs w:val="18"/>
         </w:rPr>
         <w:t>ulica_a_cislo</w:t>
       </w:r>
       <w:proofErr w:type="spellEnd"/>
       <w:r>
         <w:rPr>
-          <w:rFonts w:ascii="ArialNarrow" w:hAnsi="ArialNarrow" w:cs="ArialNarrow"/>
+          <w:rFonts w:ascii="Arial" w:hAnsi="Arial" w:cs="Arial"/>
+          <w:szCs w:val="18"/>
         </w:rPr>
-        <w:t>}}</w:t>
-      </w:r>
-      <w:r>
-        <w:rPr>
-          <w:rFonts w:ascii="ArialNarrow" w:hAnsi="ArialNarrow" w:cs="ArialNarrow"/>
-        </w:rPr>
-        <w:t>,</w:t>
+        <w:t>}},</w:t>
       </w:r>
     </w:p>
     <w:p>
@@ -9066,7 +9309,7 @@
           <w:rFonts w:ascii="Arial" w:hAnsi="Arial" w:cs="Arial"/>
           <w:szCs w:val="18"/>
         </w:rPr>
-        <w:t>psc_mesto</w:t>
+        <w:t>psc</w:t>
       </w:r>
       <w:proofErr w:type="spellEnd"/>
       <w:r>
@@ -9074,7 +9317,7 @@
           <w:rFonts w:ascii="Arial" w:hAnsi="Arial" w:cs="Arial"/>
           <w:szCs w:val="18"/>
         </w:rPr>
-        <w:t>}}</w:t>
+        <w:t>}} {{mesto}}</w:t>
       </w:r>
     </w:p>
     <w:p>
@@ -16582,7 +16825,7 @@
           <w:szCs w:val="18"/>
         </w:rPr>
         <w:drawing>
-          <wp:anchor distT="0" distB="0" distL="114300" distR="114300" simplePos="0" relativeHeight="251665408" behindDoc="0" locked="0" layoutInCell="1" allowOverlap="1" wp14:anchorId="663E02DD" wp14:editId="1FAEA91B">
+          <wp:anchor distT="0" distB="0" distL="114300" distR="114300" simplePos="0" relativeHeight="251665408" behindDoc="0" locked="0" layoutInCell="1" allowOverlap="1" wp14:anchorId="663E02DD" wp14:editId="2FCD71A2">
             <wp:simplePos x="0" y="0"/>
             <wp:positionH relativeFrom="column">
               <wp:posOffset>4592320</wp:posOffset>

</xml_diff>